<commit_message>
Align query descriptions with extended model
</commit_message>
<xml_diff>
--- a/docs/MC3_Bericht_Pulver_Urech.docx
+++ b/docs/MC3_Bericht_Pulver_Urech.docx
@@ -604,8 +604,9 @@
         <w:tblLook w:firstColumn="1" w:firstRow="1" w:lastColumn="0" w:lastRow="0" w:noHBand="0" w:noVBand="1" w:val="04A0"/>
       </w:tblPr>
       <w:tblGrid>
-        <w:gridCol w:w="1716"/>
-        <w:gridCol w:w="7355"/>
+        <w:gridCol w:w="1165"/>
+        <w:gridCol w:w="4993"/>
+        <w:gridCol w:w="2913"/>
       </w:tblGrid>
       <w:tr>
         <w:trPr>
@@ -613,7 +614,7 @@
         </w:trPr>
         <w:tc>
           <w:tcPr>
-            <w:tcW w:type="dxa" w:w="1716"/>
+            <w:tcW w:type="dxa" w:w="1165"/>
             <w:shd w:val="clear" w:color="auto" w:fill="DCE6F0"/>
           </w:tcPr>
           <w:p>
@@ -633,7 +634,7 @@
         </w:tc>
         <w:tc>
           <w:tcPr>
-            <w:tcW w:type="dxa" w:w="7355"/>
+            <w:tcW w:type="dxa" w:w="4993"/>
             <w:shd w:val="clear" w:color="auto" w:fill="DCE6F0"/>
           </w:tcPr>
           <w:p>
@@ -648,6 +649,26 @@
                 <w:sz w:val="17"/>
               </w:rPr>
               <w:t>Frage</w:t>
+            </w:r>
+          </w:p>
+        </w:tc>
+        <w:tc>
+          <w:tcPr>
+            <w:tcW w:type="dxa" w:w="2913"/>
+            <w:shd w:val="clear" w:color="auto" w:fill="DCE6F0"/>
+          </w:tcPr>
+          <w:p>
+            <w:pPr>
+              <w:keepNext/>
+              <w:spacing w:after="0"/>
+              <w:jc w:val="left"/>
+            </w:pPr>
+            <w:r>
+              <w:rPr>
+                <w:b/>
+                <w:sz w:val="17"/>
+              </w:rPr>
+              <w:t>Beteiligte Entitäten</w:t>
             </w:r>
           </w:p>
         </w:tc>
@@ -658,7 +679,7 @@
         </w:trPr>
         <w:tc>
           <w:tcPr>
-            <w:tcW w:type="dxa" w:w="1716"/>
+            <w:tcW w:type="dxa" w:w="1165"/>
           </w:tcPr>
           <w:p>
             <w:pPr>
@@ -677,7 +698,7 @@
         </w:tc>
         <w:tc>
           <w:tcPr>
-            <w:tcW w:type="dxa" w:w="7355"/>
+            <w:tcW w:type="dxa" w:w="4993"/>
           </w:tcPr>
           <w:p>
             <w:pPr>
@@ -691,6 +712,25 @@
                 <w:sz w:val="17"/>
               </w:rPr>
               <w:t>Welche Kurse setzt ein Zielkurs direkt voraus?</w:t>
+            </w:r>
+          </w:p>
+        </w:tc>
+        <w:tc>
+          <w:tcPr>
+            <w:tcW w:type="dxa" w:w="2913"/>
+          </w:tcPr>
+          <w:p>
+            <w:pPr>
+              <w:keepNext/>
+              <w:spacing w:after="0"/>
+              <w:jc w:val="left"/>
+            </w:pPr>
+            <w:r>
+              <w:rPr>
+                <w:b w:val="0"/>
+                <w:sz w:val="17"/>
+              </w:rPr>
+              <w:t>Kurs</w:t>
             </w:r>
           </w:p>
         </w:tc>
@@ -701,7 +741,7 @@
         </w:trPr>
         <w:tc>
           <w:tcPr>
-            <w:tcW w:type="dxa" w:w="1716"/>
+            <w:tcW w:type="dxa" w:w="1165"/>
           </w:tcPr>
           <w:p>
             <w:pPr>
@@ -720,7 +760,7 @@
         </w:tc>
         <w:tc>
           <w:tcPr>
-            <w:tcW w:type="dxa" w:w="7355"/>
+            <w:tcW w:type="dxa" w:w="4993"/>
           </w:tcPr>
           <w:p>
             <w:pPr>
@@ -734,6 +774,25 @@
                 <w:sz w:val="17"/>
               </w:rPr>
               <w:t>Welche Kurse setzt ein Zielkurs insgesamt voraus, über alle Stufen und ohne Duplikate?</w:t>
+            </w:r>
+          </w:p>
+        </w:tc>
+        <w:tc>
+          <w:tcPr>
+            <w:tcW w:type="dxa" w:w="2913"/>
+          </w:tcPr>
+          <w:p>
+            <w:pPr>
+              <w:keepNext/>
+              <w:spacing w:after="0"/>
+              <w:jc w:val="left"/>
+            </w:pPr>
+            <w:r>
+              <w:rPr>
+                <w:b w:val="0"/>
+                <w:sz w:val="17"/>
+              </w:rPr>
+              <w:t>Kurs</w:t>
             </w:r>
           </w:p>
         </w:tc>
@@ -744,7 +803,7 @@
         </w:trPr>
         <w:tc>
           <w:tcPr>
-            <w:tcW w:type="dxa" w:w="1716"/>
+            <w:tcW w:type="dxa" w:w="1165"/>
           </w:tcPr>
           <w:p>
             <w:pPr>
@@ -763,7 +822,7 @@
         </w:tc>
         <w:tc>
           <w:tcPr>
-            <w:tcW w:type="dxa" w:w="7355"/>
+            <w:tcW w:type="dxa" w:w="4993"/>
           </w:tcPr>
           <w:p>
             <w:pPr>
@@ -776,7 +835,26 @@
                 <w:b w:val="0"/>
                 <w:sz w:val="17"/>
               </w:rPr>
-              <w:t>Welche Kurse darf eine Person jetzt belegen?</w:t>
+              <w:t>Welche Kurse darf eine Person als Nächstes belegen, weil sie alle Vorkurse abgeschlossen und den Kurs selbst noch nicht belegt hat?</w:t>
+            </w:r>
+          </w:p>
+        </w:tc>
+        <w:tc>
+          <w:tcPr>
+            <w:tcW w:type="dxa" w:w="2913"/>
+          </w:tcPr>
+          <w:p>
+            <w:pPr>
+              <w:keepNext/>
+              <w:spacing w:after="0"/>
+              <w:jc w:val="left"/>
+            </w:pPr>
+            <w:r>
+              <w:rPr>
+                <w:b w:val="0"/>
+                <w:sz w:val="17"/>
+              </w:rPr>
+              <w:t>Lernende Person, Durchführung, Kurs</w:t>
             </w:r>
           </w:p>
         </w:tc>
@@ -787,7 +865,7 @@
         </w:trPr>
         <w:tc>
           <w:tcPr>
-            <w:tcW w:type="dxa" w:w="1716"/>
+            <w:tcW w:type="dxa" w:w="1165"/>
           </w:tcPr>
           <w:p>
             <w:pPr>
@@ -806,7 +884,7 @@
         </w:tc>
         <w:tc>
           <w:tcPr>
-            <w:tcW w:type="dxa" w:w="7355"/>
+            <w:tcW w:type="dxa" w:w="4993"/>
           </w:tcPr>
           <w:p>
             <w:pPr>
@@ -819,7 +897,26 @@
                 <w:b w:val="0"/>
                 <w:sz w:val="17"/>
               </w:rPr>
-              <w:t>Welche Vorkurse fehlen einer Person für einen Zielkurs, und wie viele Stunden sind das?</w:t>
+              <w:t>Welche Vorkurse fehlen einer Person für einen Zielkurs, und wie viele Stunden sind das? Laufende Belegungen zählen als fehlend</w:t>
+            </w:r>
+          </w:p>
+        </w:tc>
+        <w:tc>
+          <w:tcPr>
+            <w:tcW w:type="dxa" w:w="2913"/>
+          </w:tcPr>
+          <w:p>
+            <w:pPr>
+              <w:keepNext/>
+              <w:spacing w:after="0"/>
+              <w:jc w:val="left"/>
+            </w:pPr>
+            <w:r>
+              <w:rPr>
+                <w:b w:val="0"/>
+                <w:sz w:val="17"/>
+              </w:rPr>
+              <w:t>Lernende Person, Durchführung, Kurs</w:t>
             </w:r>
           </w:p>
         </w:tc>
@@ -830,7 +927,7 @@
         </w:trPr>
         <w:tc>
           <w:tcPr>
-            <w:tcW w:type="dxa" w:w="1716"/>
+            <w:tcW w:type="dxa" w:w="1165"/>
           </w:tcPr>
           <w:p>
             <w:pPr>
@@ -848,7 +945,7 @@
         </w:tc>
         <w:tc>
           <w:tcPr>
-            <w:tcW w:type="dxa" w:w="7355"/>
+            <w:tcW w:type="dxa" w:w="4993"/>
           </w:tcPr>
           <w:p>
             <w:pPr>
@@ -860,7 +957,25 @@
                 <w:b w:val="0"/>
                 <w:sz w:val="17"/>
               </w:rPr>
-              <w:t>Welche Durchführungen dieser Kurse finden in einem Semester an einem Standort in der Studienform der Person statt?</w:t>
+              <w:t>Welche Durchführungen der Kurse aus A-003 finden in einem Semester an einem Standort in der Studienform der Person statt, und wer unterrichtet sie?</w:t>
+            </w:r>
+          </w:p>
+        </w:tc>
+        <w:tc>
+          <w:tcPr>
+            <w:tcW w:type="dxa" w:w="2913"/>
+          </w:tcPr>
+          <w:p>
+            <w:pPr>
+              <w:spacing w:after="0"/>
+              <w:jc w:val="left"/>
+            </w:pPr>
+            <w:r>
+              <w:rPr>
+                <w:b w:val="0"/>
+                <w:sz w:val="17"/>
+              </w:rPr>
+              <w:t>alle sechs</w:t>
             </w:r>
           </w:p>
         </w:tc>
@@ -1446,7 +1561,7 @@
       <w:r>
         <w:drawing>
           <wp:inline xmlns:a="http://schemas.openxmlformats.org/drawingml/2006/main" xmlns:pic="http://schemas.openxmlformats.org/drawingml/2006/picture">
-            <wp:extent cx="5580000" cy="4132089"/>
+            <wp:extent cx="5580000" cy="3818925"/>
             <wp:docPr id="166964197" name="Picture 166964197"/>
             <wp:cNvGraphicFramePr>
               <a:graphicFrameLocks noChangeAspect="1"/>
@@ -1467,7 +1582,7 @@
                   <pic:spPr>
                     <a:xfrm>
                       <a:off x="0" y="0"/>
-                      <a:ext cx="5580000" cy="4132089"/>
+                      <a:ext cx="5580000" cy="3818925"/>
                     </a:xfrm>
                     <a:prstGeom prst="rect"/>
                   </pic:spPr>

</xml_diff>

<commit_message>
Shorten report to stay within page limit
</commit_message>
<xml_diff>
--- a/docs/MC3_Bericht_Pulver_Urech.docx
+++ b/docs/MC3_Bericht_Pulver_Urech.docx
@@ -1218,71 +1218,11 @@
       </w:r>
     </w:p>
     <w:p>
-      <w:pPr>
-        <w:keepNext/>
-        <w:spacing w:after="40"/>
-      </w:pPr>
-      <w:r>
-        <w:rPr>
-          <w:b/>
-        </w:rPr>
-        <w:t>Andere NoSQL-Typen</w:t>
-      </w:r>
-    </w:p>
-    <w:p>
-      <w:pPr>
-        <w:pStyle w:val="Listenabsatz"/>
-        <w:numPr>
-          <w:ilvl w:val="0"/>
-          <w:numId w:val="1"/>
-        </w:numPr>
-      </w:pPr>
-      <w:r>
-        <w:rPr>
-          <w:b/>
-        </w:rPr>
-        <w:t>Dokument (MongoDB):</w:t>
-      </w:r>
-      <w:r>
-        <w:rPr>
-          <w:b w:val="0"/>
-        </w:rPr>
-        <w:t xml:space="preserve"> Ein Vorkurs gehört zu vielen Kursen. Eingebettet entstehen Duplikate. Als Referenz ist die mehrstufige Suche mit </w:t>
-      </w:r>
-      <w:r>
-        <w:rPr>
-          <w:rFonts w:ascii="Consolas" w:hAnsi="Consolas"/>
-          <w:b w:val="0"/>
-          <w:sz w:val="18"/>
-        </w:rPr>
-        <w:t>$graphLookup</w:t>
-      </w:r>
-      <w:r>
-        <w:rPr>
-          <w:b w:val="0"/>
-        </w:rPr>
-        <w:t xml:space="preserve"> möglich, die Kurse bleiben aber Dokumente ohne eigene Kanten</w:t>
-      </w:r>
-    </w:p>
-    <w:p>
-      <w:pPr>
-        <w:pStyle w:val="Listenabsatz"/>
-        <w:numPr>
-          <w:ilvl w:val="0"/>
-          <w:numId w:val="1"/>
-        </w:numPr>
-      </w:pPr>
-      <w:r>
-        <w:rPr>
-          <w:b/>
-        </w:rPr>
-        <w:t>Key-Value und Column Store:</w:t>
-      </w:r>
-      <w:r>
-        <w:rPr>
-          <w:b w:val="0"/>
-        </w:rPr>
-        <w:t xml:space="preserve"> Zugriff über Schlüssel, keine Abfrage, die Beziehungen über mehrere Stufen verfolgt</w:t>
+      <w:r>
+        <w:rPr>
+          <w:b w:val="0"/>
+        </w:rPr>
+        <w:t>Dokument-, Key-Value- und Column-Datenbanken passen weniger gut. Ein Vorkurs gehört zu vielen Kursen und würde eingebettet dupliziert, und mehrstufige Beziehungen sind dort nicht das zentrale Abfragemuster.</w:t>
       </w:r>
     </w:p>
     <w:p>
@@ -1309,7 +1249,7 @@
       <w:r>
         <w:drawing>
           <wp:inline xmlns:a="http://schemas.openxmlformats.org/drawingml/2006/main" xmlns:pic="http://schemas.openxmlformats.org/drawingml/2006/picture">
-            <wp:extent cx="5580000" cy="3727266"/>
+            <wp:extent cx="4680000" cy="3126094"/>
             <wp:docPr id="166964196" name="Picture 166964196"/>
             <wp:cNvGraphicFramePr>
               <a:graphicFrameLocks noChangeAspect="1"/>
@@ -1330,7 +1270,7 @@
                   <pic:spPr>
                     <a:xfrm>
                       <a:off x="0" y="0"/>
-                      <a:ext cx="5580000" cy="3727266"/>
+                      <a:ext cx="4680000" cy="3126094"/>
                     </a:xfrm>
                     <a:prstGeom prst="rect"/>
                   </pic:spPr>
@@ -1561,7 +1501,7 @@
       <w:r>
         <w:drawing>
           <wp:inline xmlns:a="http://schemas.openxmlformats.org/drawingml/2006/main" xmlns:pic="http://schemas.openxmlformats.org/drawingml/2006/picture">
-            <wp:extent cx="5580000" cy="3818925"/>
+            <wp:extent cx="5040000" cy="3449351"/>
             <wp:docPr id="166964197" name="Picture 166964197"/>
             <wp:cNvGraphicFramePr>
               <a:graphicFrameLocks noChangeAspect="1"/>
@@ -1582,7 +1522,7 @@
                   <pic:spPr>
                     <a:xfrm>
                       <a:off x="0" y="0"/>
-                      <a:ext cx="5580000" cy="3818925"/>
+                      <a:ext cx="5040000" cy="3449351"/>
                     </a:xfrm>
                     <a:prstGeom prst="rect"/>
                   </pic:spPr>
@@ -2638,328 +2578,46 @@
         <w:rPr>
           <w:b w:val="0"/>
         </w:rPr>
-        <w:t xml:space="preserve"> Prüfungen zu Abfragen, Integrität, Export und Import, Datenänderungen und Strukturänderungen. Die Prüfungen laufen in einer Transaktion und hinterlassen keine Änderungen. Auf PostgreSQL sind alle bestanden.</w:t>
-      </w:r>
-    </w:p>
-    <w:tbl>
-      <w:tblPr>
-        <w:tblStyle w:val="Tabellenraster"/>
-        <w:tblW w:type="auto" w:w="0"/>
-        <w:tblLayout w:type="fixed"/>
-        <w:tblLook w:firstColumn="1" w:firstRow="1" w:lastColumn="0" w:lastRow="0" w:noHBand="0" w:noVBand="1" w:val="04A0"/>
-      </w:tblPr>
-      <w:tblGrid>
-        <w:gridCol w:w="4413"/>
-        <w:gridCol w:w="4658"/>
-      </w:tblGrid>
-      <w:tr>
-        <w:trPr>
-          <w:cantSplit/>
-        </w:trPr>
-        <w:tc>
-          <w:tcPr>
-            <w:tcW w:type="dxa" w:w="4413"/>
-            <w:shd w:val="clear" w:color="auto" w:fill="DCE6F0"/>
-          </w:tcPr>
-          <w:p>
-            <w:pPr>
-              <w:keepNext/>
-              <w:spacing w:after="0"/>
-              <w:jc w:val="left"/>
-            </w:pPr>
-            <w:r>
-              <w:rPr>
-                <w:b/>
-                <w:sz w:val="17"/>
-              </w:rPr>
-              <w:t>Abfrage</w:t>
-            </w:r>
-          </w:p>
-        </w:tc>
-        <w:tc>
-          <w:tcPr>
-            <w:tcW w:type="dxa" w:w="4658"/>
-            <w:shd w:val="clear" w:color="auto" w:fill="DCE6F0"/>
-          </w:tcPr>
-          <w:p>
-            <w:pPr>
-              <w:keepNext/>
-              <w:spacing w:after="0"/>
-              <w:jc w:val="left"/>
-            </w:pPr>
-            <w:r>
-              <w:rPr>
-                <w:b/>
-                <w:sz w:val="17"/>
-              </w:rPr>
-              <w:t>Ergebnis</w:t>
-            </w:r>
-          </w:p>
-        </w:tc>
-      </w:tr>
-      <w:tr>
-        <w:trPr>
-          <w:cantSplit/>
-        </w:trPr>
-        <w:tc>
-          <w:tcPr>
-            <w:tcW w:type="dxa" w:w="4413"/>
-          </w:tcPr>
-          <w:p>
-            <w:pPr>
-              <w:keepNext/>
-              <w:spacing w:after="0"/>
-              <w:jc w:val="left"/>
-            </w:pPr>
-            <w:r>
-              <w:rPr>
-                <w:b w:val="0"/>
-                <w:sz w:val="17"/>
-              </w:rPr>
-              <w:t xml:space="preserve">A-001 für </w:t>
-            </w:r>
-            <w:r>
-              <w:rPr>
-                <w:rFonts w:ascii="Consolas" w:hAnsi="Consolas"/>
-                <w:b w:val="0"/>
-                <w:sz w:val="16"/>
-              </w:rPr>
-              <w:t>PROJ</w:t>
-            </w:r>
-          </w:p>
-        </w:tc>
-        <w:tc>
-          <w:tcPr>
-            <w:tcW w:type="dxa" w:w="4658"/>
-          </w:tcPr>
-          <w:p>
-            <w:pPr>
-              <w:keepNext/>
-              <w:spacing w:after="0"/>
-              <w:jc w:val="left"/>
-            </w:pPr>
-            <w:r>
-              <w:rPr>
-                <w:b w:val="0"/>
-                <w:sz w:val="17"/>
-              </w:rPr>
-              <w:t>DE, ML, NOSQL</w:t>
-            </w:r>
-          </w:p>
-        </w:tc>
-      </w:tr>
-      <w:tr>
-        <w:trPr>
-          <w:cantSplit/>
-        </w:trPr>
-        <w:tc>
-          <w:tcPr>
-            <w:tcW w:type="dxa" w:w="4413"/>
-          </w:tcPr>
-          <w:p>
-            <w:pPr>
-              <w:keepNext/>
-              <w:spacing w:after="0"/>
-              <w:jc w:val="left"/>
-            </w:pPr>
-            <w:r>
-              <w:rPr>
-                <w:b w:val="0"/>
-                <w:sz w:val="17"/>
-              </w:rPr>
-              <w:t xml:space="preserve">A-002 für </w:t>
-            </w:r>
-            <w:r>
-              <w:rPr>
-                <w:rFonts w:ascii="Consolas" w:hAnsi="Consolas"/>
-                <w:b w:val="0"/>
-                <w:sz w:val="16"/>
-              </w:rPr>
-              <w:t>PROJ</w:t>
-            </w:r>
-          </w:p>
-        </w:tc>
-        <w:tc>
-          <w:tcPr>
-            <w:tcW w:type="dxa" w:w="4658"/>
-          </w:tcPr>
-          <w:p>
-            <w:pPr>
-              <w:keepNext/>
-              <w:spacing w:after="0"/>
-              <w:jc w:val="left"/>
-            </w:pPr>
-            <w:r>
-              <w:rPr>
-                <w:b w:val="0"/>
-                <w:sz w:val="17"/>
-              </w:rPr>
-              <w:t>DE, EIN, ML, MOD, NOSQL, PY, SQL, STAT</w:t>
-            </w:r>
-          </w:p>
-        </w:tc>
-      </w:tr>
-      <w:tr>
-        <w:trPr>
-          <w:cantSplit/>
-        </w:trPr>
-        <w:tc>
-          <w:tcPr>
-            <w:tcW w:type="dxa" w:w="4413"/>
-          </w:tcPr>
-          <w:p>
-            <w:pPr>
-              <w:keepNext/>
-              <w:spacing w:after="0"/>
-              <w:jc w:val="left"/>
-            </w:pPr>
-            <w:r>
-              <w:rPr>
-                <w:b w:val="0"/>
-                <w:sz w:val="17"/>
-              </w:rPr>
-              <w:t>A-003 für Person 1</w:t>
-            </w:r>
-          </w:p>
-        </w:tc>
-        <w:tc>
-          <w:tcPr>
-            <w:tcW w:type="dxa" w:w="4658"/>
-          </w:tcPr>
-          <w:p>
-            <w:pPr>
-              <w:keepNext/>
-              <w:spacing w:after="0"/>
-              <w:jc w:val="left"/>
-            </w:pPr>
-            <w:r>
-              <w:rPr>
-                <w:b w:val="0"/>
-                <w:sz w:val="17"/>
-              </w:rPr>
-              <w:t>NOSQL, PY, STAT</w:t>
-            </w:r>
-          </w:p>
-        </w:tc>
-      </w:tr>
-      <w:tr>
-        <w:trPr>
-          <w:cantSplit/>
-        </w:trPr>
-        <w:tc>
-          <w:tcPr>
-            <w:tcW w:type="dxa" w:w="4413"/>
-          </w:tcPr>
-          <w:p>
-            <w:pPr>
-              <w:keepNext/>
-              <w:spacing w:after="0"/>
-              <w:jc w:val="left"/>
-            </w:pPr>
-            <w:r>
-              <w:rPr>
-                <w:b w:val="0"/>
-                <w:sz w:val="17"/>
-              </w:rPr>
-              <w:t xml:space="preserve">A-004 für </w:t>
-            </w:r>
-            <w:r>
-              <w:rPr>
-                <w:rFonts w:ascii="Consolas" w:hAnsi="Consolas"/>
-                <w:b w:val="0"/>
-                <w:sz w:val="16"/>
-              </w:rPr>
-              <w:t>PROJ</w:t>
-            </w:r>
-            <w:r>
-              <w:rPr>
-                <w:b w:val="0"/>
-                <w:sz w:val="17"/>
-              </w:rPr>
-              <w:t xml:space="preserve"> und Person 1</w:t>
-            </w:r>
-          </w:p>
-        </w:tc>
-        <w:tc>
-          <w:tcPr>
-            <w:tcW w:type="dxa" w:w="4658"/>
-          </w:tcPr>
-          <w:p>
-            <w:pPr>
-              <w:keepNext/>
-              <w:spacing w:after="0"/>
-              <w:jc w:val="left"/>
-            </w:pPr>
-            <w:r>
-              <w:rPr>
-                <w:b w:val="0"/>
-                <w:sz w:val="17"/>
-              </w:rPr>
-              <w:t xml:space="preserve">DE, ML, NOSQL, PY, STAT mit </w:t>
-            </w:r>
-            <w:r>
-              <w:rPr>
-                <w:b/>
-                <w:sz w:val="17"/>
-              </w:rPr>
-              <w:t>42</w:t>
-            </w:r>
-            <w:r>
-              <w:rPr>
-                <w:b w:val="0"/>
-                <w:sz w:val="17"/>
-              </w:rPr>
-              <w:t xml:space="preserve"> Stunden</w:t>
-            </w:r>
-          </w:p>
-        </w:tc>
-      </w:tr>
-      <w:tr>
-        <w:trPr>
-          <w:cantSplit/>
-        </w:trPr>
-        <w:tc>
-          <w:tcPr>
-            <w:tcW w:type="dxa" w:w="4413"/>
-          </w:tcPr>
-          <w:p>
-            <w:pPr>
-              <w:spacing w:after="0"/>
-              <w:jc w:val="left"/>
-            </w:pPr>
-            <w:r>
-              <w:rPr>
-                <w:b w:val="0"/>
-                <w:sz w:val="17"/>
-              </w:rPr>
-              <w:t>A-005 für Person 1, FS27, Standort 1</w:t>
-            </w:r>
-          </w:p>
-        </w:tc>
-        <w:tc>
-          <w:tcPr>
-            <w:tcW w:type="dxa" w:w="4658"/>
-          </w:tcPr>
-          <w:p>
-            <w:pPr>
-              <w:spacing w:after="0"/>
-              <w:jc w:val="left"/>
-            </w:pPr>
-            <w:r>
-              <w:rPr>
-                <w:b w:val="0"/>
-                <w:sz w:val="17"/>
-              </w:rPr>
-              <w:t>Durchführung 10 (NOSQL) und 12 (PY)</w:t>
-            </w:r>
-          </w:p>
-        </w:tc>
-      </w:tr>
-    </w:tbl>
-    <w:p>
-      <w:pPr>
-        <w:spacing w:after="0"/>
-      </w:pPr>
+        <w:t xml:space="preserve"> Prüfungen zu Abfragen, Integrität, Export und Import, Datenänderungen und Strukturänderungen. Die Prüfungen laufen in einer Transaktion und hinterlassen keine Änderungen. Auf PostgreSQL sind alle bestanden. Für Person 1 fehlen vor </w:t>
+      </w:r>
+      <w:r>
+        <w:rPr>
+          <w:rFonts w:ascii="Consolas" w:hAnsi="Consolas"/>
+          <w:b w:val="0"/>
+          <w:sz w:val="18"/>
+        </w:rPr>
+        <w:t>PROJ</w:t>
+      </w:r>
+      <w:r>
+        <w:rPr>
+          <w:b w:val="0"/>
+        </w:rPr>
+        <w:t xml:space="preserve"> zum Beispiel </w:t>
+      </w:r>
+      <w:r>
+        <w:rPr>
+          <w:b/>
+        </w:rPr>
+        <w:t>5</w:t>
+      </w:r>
+      <w:r>
+        <w:rPr>
+          <w:b w:val="0"/>
+        </w:rPr>
+        <w:t xml:space="preserve"> Vorkurse mit </w:t>
+      </w:r>
+      <w:r>
+        <w:rPr>
+          <w:b/>
+        </w:rPr>
+        <w:t>42</w:t>
+      </w:r>
+      <w:r>
+        <w:rPr>
+          <w:b w:val="0"/>
+        </w:rPr>
+        <w:t xml:space="preserve"> Stunden.</w:t>
+      </w:r>
     </w:p>
     <w:p>
       <w:pPr>
@@ -3224,7 +2882,7 @@
       <w:r>
         <w:drawing>
           <wp:inline xmlns:a="http://schemas.openxmlformats.org/drawingml/2006/main" xmlns:pic="http://schemas.openxmlformats.org/drawingml/2006/picture">
-            <wp:extent cx="5580000" cy="2319273"/>
+            <wp:extent cx="4320000" cy="1795567"/>
             <wp:docPr id="166964198" name="Picture 166964198"/>
             <wp:cNvGraphicFramePr>
               <a:graphicFrameLocks noChangeAspect="1"/>
@@ -3245,7 +2903,7 @@
                   <pic:spPr>
                     <a:xfrm>
                       <a:off x="0" y="0"/>
-                      <a:ext cx="5580000" cy="2319273"/>
+                      <a:ext cx="4320000" cy="1795567"/>
                     </a:xfrm>
                     <a:prstGeom prst="rect"/>
                   </pic:spPr>
@@ -4411,81 +4069,6 @@
     </w:p>
     <w:p>
       <w:pPr>
-        <w:keepNext/>
-        <w:spacing w:after="0" w:before="0" w:line="240" w:lineRule="auto"/>
-        <w:ind w:left="170"/>
-        <w:shd w:val="clear" w:color="auto" w:fill="F2F2F2"/>
-      </w:pPr>
-      <w:r>
-        <w:rPr>
-          <w:rFonts w:ascii="Consolas" w:hAnsi="Consolas"/>
-          <w:sz w:val="17"/>
-        </w:rPr>
-        <w:t>MATCH (:Course {id: $course})-[:REQUIRES*1..]-&gt;(p:Course)</w:t>
-      </w:r>
-    </w:p>
-    <w:p>
-      <w:pPr>
-        <w:keepNext/>
-        <w:spacing w:after="0" w:before="0" w:line="240" w:lineRule="auto"/>
-        <w:ind w:left="170"/>
-        <w:shd w:val="clear" w:color="auto" w:fill="F2F2F2"/>
-      </w:pPr>
-      <w:r>
-        <w:rPr>
-          <w:rFonts w:ascii="Consolas" w:hAnsi="Consolas"/>
-          <w:sz w:val="17"/>
-        </w:rPr>
-        <w:t>WITH DISTINCT p</w:t>
-      </w:r>
-    </w:p>
-    <w:p>
-      <w:pPr>
-        <w:keepNext/>
-        <w:spacing w:after="0" w:before="0" w:line="240" w:lineRule="auto"/>
-        <w:ind w:left="170"/>
-        <w:shd w:val="clear" w:color="auto" w:fill="F2F2F2"/>
-      </w:pPr>
-      <w:r>
-        <w:rPr>
-          <w:rFonts w:ascii="Consolas" w:hAnsi="Consolas"/>
-          <w:sz w:val="17"/>
-        </w:rPr>
-        <w:t>WHERE p.id &lt;&gt; $course</w:t>
-      </w:r>
-    </w:p>
-    <w:p>
-      <w:pPr>
-        <w:keepNext/>
-        <w:spacing w:after="0" w:before="0" w:line="240" w:lineRule="auto"/>
-        <w:ind w:left="170"/>
-        <w:shd w:val="clear" w:color="auto" w:fill="F2F2F2"/>
-      </w:pPr>
-      <w:r>
-        <w:rPr>
-          <w:rFonts w:ascii="Consolas" w:hAnsi="Consolas"/>
-          <w:sz w:val="17"/>
-        </w:rPr>
-        <w:t>RETURN p.id AS course_id, p.title AS title, p.hours AS hours</w:t>
-      </w:r>
-    </w:p>
-    <w:p>
-      <w:pPr>
-        <w:keepNext w:val="0"/>
-        <w:spacing w:after="160" w:before="0" w:line="240" w:lineRule="auto"/>
-        <w:ind w:left="170"/>
-        <w:shd w:val="clear" w:color="auto" w:fill="F2F2F2"/>
-      </w:pPr>
-      <w:r>
-        <w:rPr>
-          <w:rFonts w:ascii="Consolas" w:hAnsi="Consolas"/>
-          <w:sz w:val="17"/>
-        </w:rPr>
-        <w:t>ORDER BY course_id;</w:t>
-      </w:r>
-    </w:p>
-    <w:p>
-      <w:pPr>
         <w:pStyle w:val="berschrift1"/>
       </w:pPr>
       <w:r>
@@ -4958,20 +4541,6 @@
           <w:b w:val="0"/>
           <w:sz w:val="18"/>
         </w:rPr>
-        <w:t>course_run</w:t>
-      </w:r>
-      <w:r>
-        <w:rPr>
-          <w:b w:val="0"/>
-        </w:rPr>
-        <w:t xml:space="preserve">, </w:t>
-      </w:r>
-      <w:r>
-        <w:rPr>
-          <w:rFonts w:ascii="Consolas" w:hAnsi="Consolas"/>
-          <w:b w:val="0"/>
-          <w:sz w:val="18"/>
-        </w:rPr>
         <w:t>enrollment</w:t>
       </w:r>
       <w:r>
@@ -4991,69 +4560,6 @@
           <w:b w:val="0"/>
         </w:rPr>
         <w:t xml:space="preserve"> Personen, Person 1 hat die untere Hälfte der Stufen abgeschlossen</w:t>
-      </w:r>
-    </w:p>
-    <w:p>
-      <w:pPr>
-        <w:pStyle w:val="Listenabsatz"/>
-        <w:numPr>
-          <w:ilvl w:val="0"/>
-          <w:numId w:val="1"/>
-        </w:numPr>
-      </w:pPr>
-      <w:r>
-        <w:rPr>
-          <w:rFonts w:ascii="Consolas" w:hAnsi="Consolas"/>
-          <w:b w:val="0"/>
-          <w:sz w:val="18"/>
-        </w:rPr>
-        <w:t>semester</w:t>
-      </w:r>
-      <w:r>
-        <w:rPr>
-          <w:b w:val="0"/>
-        </w:rPr>
-        <w:t xml:space="preserve">, </w:t>
-      </w:r>
-      <w:r>
-        <w:rPr>
-          <w:rFonts w:ascii="Consolas" w:hAnsi="Consolas"/>
-          <w:b w:val="0"/>
-          <w:sz w:val="18"/>
-        </w:rPr>
-        <w:t>location</w:t>
-      </w:r>
-      <w:r>
-        <w:rPr>
-          <w:b w:val="0"/>
-        </w:rPr>
-        <w:t xml:space="preserve">, </w:t>
-      </w:r>
-      <w:r>
-        <w:rPr>
-          <w:rFonts w:ascii="Consolas" w:hAnsi="Consolas"/>
-          <w:b w:val="0"/>
-          <w:sz w:val="18"/>
-        </w:rPr>
-        <w:t>lecturer</w:t>
-      </w:r>
-      <w:r>
-        <w:rPr>
-          <w:b w:val="0"/>
-        </w:rPr>
-        <w:t xml:space="preserve">: je </w:t>
-      </w:r>
-      <w:r>
-        <w:rPr>
-          <w:b/>
-        </w:rPr>
-        <w:t>2</w:t>
-      </w:r>
-      <w:r>
-        <w:rPr>
-          <w:b w:val="0"/>
-        </w:rPr>
-        <w:t xml:space="preserve"> Einträge für gültige Durchführungen</w:t>
       </w:r>
     </w:p>
     <w:p>
@@ -5080,7 +4586,7 @@
         <w:rPr>
           <w:b w:val="0"/>
         </w:rPr>
-        <w:t>Datensatz erzeugen und in beide Datenbanken laden (</w:t>
+        <w:t>Datensatz erzeugen, in beide Datenbanken laden und K1 prüfen (</w:t>
       </w:r>
       <w:r>
         <w:rPr>
@@ -5107,9 +4613,27 @@
       </w:pPr>
       <w:r>
         <w:rPr>
-          <w:b w:val="0"/>
-        </w:rPr>
-        <w:t>K1 prüfen: Weichen die Ergebnisse ab, bricht die Messung ab</w:t>
+          <w:b/>
+        </w:rPr>
+        <w:t>5</w:t>
+      </w:r>
+      <w:r>
+        <w:rPr>
+          <w:b w:val="0"/>
+        </w:rPr>
+        <w:t xml:space="preserve"> Aufwärmläufe, danach </w:t>
+      </w:r>
+      <w:r>
+        <w:rPr>
+          <w:b/>
+        </w:rPr>
+        <w:t>20</w:t>
+      </w:r>
+      <w:r>
+        <w:rPr>
+          <w:b w:val="0"/>
+        </w:rPr>
+        <w:t xml:space="preserve"> gewertete Läufe pro Abfrage und Datenbank, Reihenfolge abwechselnd</w:t>
       </w:r>
     </w:p>
     <w:p>
@@ -5122,117 +4646,29 @@
       </w:pPr>
       <w:r>
         <w:rPr>
+          <w:b w:val="0"/>
+        </w:rPr>
+        <w:t>Zeit inklusive Ergebnisübertragung im Python-Client messen, Median im Notebook auswerten</w:t>
+      </w:r>
+    </w:p>
+    <w:p>
+      <w:r>
+        <w:rPr>
+          <w:b w:val="0"/>
+        </w:rPr>
+        <w:t xml:space="preserve">Beide Datenbanken laufen in Docker auf demselben Rechner. Der Median ist robust gegen einzelne Ausreisser, Abfragen über </w:t>
+      </w:r>
+      <w:r>
+        <w:rPr>
           <w:b/>
         </w:rPr>
-        <w:t>5</w:t>
-      </w:r>
-      <w:r>
-        <w:rPr>
-          <w:b w:val="0"/>
-        </w:rPr>
-        <w:t xml:space="preserve"> Aufwärmläufe, danach </w:t>
-      </w:r>
-      <w:r>
-        <w:rPr>
-          <w:b/>
-        </w:rPr>
-        <w:t>20</w:t>
-      </w:r>
-      <w:r>
-        <w:rPr>
-          <w:b w:val="0"/>
-        </w:rPr>
-        <w:t xml:space="preserve"> gewertete Läufe pro Abfrage und Datenbank, Reihenfolge abwechselnd</w:t>
-      </w:r>
-    </w:p>
-    <w:p>
-      <w:pPr>
-        <w:pStyle w:val="Listenabsatz"/>
-        <w:numPr>
-          <w:ilvl w:val="0"/>
-          <w:numId w:val="51"/>
-        </w:numPr>
-      </w:pPr>
-      <w:r>
-        <w:rPr>
-          <w:b w:val="0"/>
-        </w:rPr>
-        <w:t xml:space="preserve">Zeit inklusive Ergebnisübertragung mit </w:t>
-      </w:r>
-      <w:r>
-        <w:rPr>
-          <w:rFonts w:ascii="Consolas" w:hAnsi="Consolas"/>
-          <w:b w:val="0"/>
-          <w:sz w:val="18"/>
-        </w:rPr>
-        <w:t>perf_counter</w:t>
-      </w:r>
-      <w:r>
-        <w:rPr>
-          <w:b w:val="0"/>
-        </w:rPr>
-        <w:t xml:space="preserve"> im Python-Client messen</w:t>
-      </w:r>
-    </w:p>
-    <w:p>
-      <w:pPr>
-        <w:pStyle w:val="Listenabsatz"/>
-        <w:numPr>
-          <w:ilvl w:val="0"/>
-          <w:numId w:val="51"/>
-        </w:numPr>
-      </w:pPr>
-      <w:r>
-        <w:rPr>
-          <w:b w:val="0"/>
-        </w:rPr>
-        <w:t xml:space="preserve">Median und Quartile im Notebook </w:t>
-      </w:r>
-      <w:r>
-        <w:rPr>
-          <w:rFonts w:ascii="Consolas" w:hAnsi="Consolas"/>
-          <w:b w:val="0"/>
-          <w:sz w:val="18"/>
-        </w:rPr>
-        <w:t>comparison/benchmark.pct.py</w:t>
-      </w:r>
-      <w:r>
-        <w:rPr>
-          <w:b w:val="0"/>
-        </w:rPr>
-        <w:t xml:space="preserve"> auswerten</w:t>
-      </w:r>
-    </w:p>
-    <w:p>
-      <w:pPr>
-        <w:keepNext/>
-        <w:spacing w:after="40"/>
-      </w:pPr>
-      <w:r>
-        <w:rPr>
-          <w:b/>
-        </w:rPr>
-        <w:t>Begründung</w:t>
-      </w:r>
-    </w:p>
-    <w:p>
-      <w:r>
-        <w:rPr>
-          <w:b w:val="0"/>
-        </w:rPr>
-        <w:t xml:space="preserve">Beide Datenbanken laufen in Docker auf demselben Rechner und werden über ihren offiziellen Python-Treiber angesprochen. Der Median ist robust gegen einzelne Ausreisser durch Hintergrundprozesse. Abfragen über </w:t>
-      </w:r>
-      <w:r>
-        <w:rPr>
-          <w:b/>
-        </w:rPr>
         <w:t>120 s</w:t>
       </w:r>
       <w:r>
         <w:rPr>
           <w:b w:val="0"/>
         </w:rPr>
-        <w:t xml:space="preserve"> werden abgebrochen und als Timeout festgehalten.</w:t>
+        <w:t xml:space="preserve"> gelten als Timeout.</w:t>
       </w:r>
     </w:p>
     <w:p>
@@ -7652,7 +7088,7 @@
       <w:r>
         <w:drawing>
           <wp:inline xmlns:a="http://schemas.openxmlformats.org/drawingml/2006/main" xmlns:pic="http://schemas.openxmlformats.org/drawingml/2006/picture">
-            <wp:extent cx="5580000" cy="3550909"/>
+            <wp:extent cx="5040000" cy="3207273"/>
             <wp:docPr id="166964199" name="Picture 166964199"/>
             <wp:cNvGraphicFramePr>
               <a:graphicFrameLocks noChangeAspect="1"/>
@@ -7673,7 +7109,7 @@
                   <pic:spPr>
                     <a:xfrm>
                       <a:off x="0" y="0"/>
-                      <a:ext cx="5580000" cy="3550909"/>
+                      <a:ext cx="5040000" cy="3207273"/>
                     </a:xfrm>
                     <a:prstGeom prst="rect"/>
                   </pic:spPr>

</xml_diff>

<commit_message>
Rephrase queries in plain language
</commit_message>
<xml_diff>
--- a/docs/MC3_Bericht_Pulver_Urech.docx
+++ b/docs/MC3_Bericht_Pulver_Urech.docx
@@ -711,7 +711,7 @@
                 <w:b w:val="0"/>
                 <w:sz w:val="17"/>
               </w:rPr>
-              <w:t>Welche Kurse setzt ein Zielkurs direkt voraus?</w:t>
+              <w:t>Welche Kurse braucht man direkt, bevor man einen bestimmten Kurs besuchen darf?</w:t>
             </w:r>
           </w:p>
         </w:tc>
@@ -773,7 +773,7 @@
                 <w:b w:val="0"/>
                 <w:sz w:val="17"/>
               </w:rPr>
-              <w:t>Welche Kurse setzt ein Zielkurs insgesamt voraus, über alle Stufen und ohne Duplikate?</w:t>
+              <w:t>Welche Kurse braucht man insgesamt für einen Kurs, also auch die Vorkurse der Vorkurse? Jeder Kurs wird nur einmal genannt</w:t>
             </w:r>
           </w:p>
         </w:tc>
@@ -835,7 +835,7 @@
                 <w:b w:val="0"/>
                 <w:sz w:val="17"/>
               </w:rPr>
-              <w:t>Welche Kurse darf eine Person als Nächstes belegen, weil sie alle Vorkurse abgeschlossen und den Kurs selbst noch nicht belegt hat?</w:t>
+              <w:t>Welche Kurse kann eine Person jetzt neu beginnen, weil sie alle nötigen Vorkurse bestanden hat und den Kurs noch nicht besucht?</w:t>
             </w:r>
           </w:p>
         </w:tc>
@@ -897,7 +897,7 @@
                 <w:b w:val="0"/>
                 <w:sz w:val="17"/>
               </w:rPr>
-              <w:t>Welche Vorkurse fehlen einer Person für einen Zielkurs, und wie viele Stunden sind das? Laufende Belegungen zählen als fehlend</w:t>
+              <w:t>Was fehlt einer Person noch bis zu ihrem Zielkurs, und wie viele Stunden sind das? Ein Kurs, den sie gerade besucht, zählt noch als fehlend</w:t>
             </w:r>
           </w:p>
         </w:tc>
@@ -957,7 +957,7 @@
                 <w:b w:val="0"/>
                 <w:sz w:val="17"/>
               </w:rPr>
-              <w:t>Welche Durchführungen der Kurse aus A-003 finden in einem Semester an einem Standort in der Studienform der Person statt, und wer unterrichtet sie?</w:t>
+              <w:t>Wo und bei wem kann eine Person diese Kurse in einem bestimmten Semester an ihrem Standort und in ihrer Studienform (Voll- oder Teilzeit) besuchen?</w:t>
             </w:r>
           </w:p>
         </w:tc>
@@ -4703,11 +4703,11 @@
         <w:tblLook w:firstColumn="1" w:firstRow="1" w:lastColumn="0" w:lastRow="0" w:noHBand="0" w:noVBand="1" w:val="04A0"/>
       </w:tblPr>
       <w:tblGrid>
-        <w:gridCol w:w="1814"/>
-        <w:gridCol w:w="1613"/>
-        <w:gridCol w:w="2016"/>
-        <w:gridCol w:w="1613"/>
-        <w:gridCol w:w="2016"/>
+        <w:gridCol w:w="1218"/>
+        <w:gridCol w:w="4062"/>
+        <w:gridCol w:w="1354"/>
+        <w:gridCol w:w="1083"/>
+        <w:gridCol w:w="1354"/>
       </w:tblGrid>
       <w:tr>
         <w:trPr>
@@ -4715,7 +4715,7 @@
         </w:trPr>
         <w:tc>
           <w:tcPr>
-            <w:tcW w:type="dxa" w:w="1814"/>
+            <w:tcW w:type="dxa" w:w="1218"/>
             <w:shd w:val="clear" w:color="auto" w:fill="DCE6F0"/>
           </w:tcPr>
           <w:p>
@@ -4735,7 +4735,7 @@
         </w:tc>
         <w:tc>
           <w:tcPr>
-            <w:tcW w:type="dxa" w:w="1613"/>
+            <w:tcW w:type="dxa" w:w="4062"/>
             <w:shd w:val="clear" w:color="auto" w:fill="DCE6F0"/>
           </w:tcPr>
           <w:p>
@@ -4755,7 +4755,7 @@
         </w:tc>
         <w:tc>
           <w:tcPr>
-            <w:tcW w:type="dxa" w:w="2016"/>
+            <w:tcW w:type="dxa" w:w="1354"/>
             <w:shd w:val="clear" w:color="auto" w:fill="DCE6F0"/>
           </w:tcPr>
           <w:p>
@@ -4775,7 +4775,7 @@
         </w:tc>
         <w:tc>
           <w:tcPr>
-            <w:tcW w:type="dxa" w:w="1613"/>
+            <w:tcW w:type="dxa" w:w="1083"/>
             <w:shd w:val="clear" w:color="auto" w:fill="DCE6F0"/>
           </w:tcPr>
           <w:p>
@@ -4795,7 +4795,7 @@
         </w:tc>
         <w:tc>
           <w:tcPr>
-            <w:tcW w:type="dxa" w:w="2016"/>
+            <w:tcW w:type="dxa" w:w="1354"/>
             <w:shd w:val="clear" w:color="auto" w:fill="DCE6F0"/>
           </w:tcPr>
           <w:p>
@@ -4820,7 +4820,7 @@
         </w:trPr>
         <w:tc>
           <w:tcPr>
-            <w:tcW w:type="dxa" w:w="1814"/>
+            <w:tcW w:type="dxa" w:w="1218"/>
           </w:tcPr>
           <w:p>
             <w:pPr>
@@ -4839,7 +4839,7 @@
         </w:tc>
         <w:tc>
           <w:tcPr>
-            <w:tcW w:type="dxa" w:w="1613"/>
+            <w:tcW w:type="dxa" w:w="4062"/>
           </w:tcPr>
           <w:p>
             <w:pPr>
@@ -4852,13 +4852,13 @@
                 <w:b w:val="0"/>
                 <w:sz w:val="17"/>
               </w:rPr>
-              <w:t>13</w:t>
+              <w:t>Welche Kurse braucht man insgesamt für einen Kurs, also auch die Vorkurse der Vorkurse? Jeder Kurs wird nur einmal genannt</w:t>
             </w:r>
           </w:p>
         </w:tc>
         <w:tc>
           <w:tcPr>
-            <w:tcW w:type="dxa" w:w="2016"/>
+            <w:tcW w:type="dxa" w:w="1354"/>
           </w:tcPr>
           <w:p>
             <w:pPr>
@@ -4877,7 +4877,7 @@
         </w:tc>
         <w:tc>
           <w:tcPr>
-            <w:tcW w:type="dxa" w:w="1613"/>
+            <w:tcW w:type="dxa" w:w="1083"/>
           </w:tcPr>
           <w:p>
             <w:pPr>
@@ -4896,7 +4896,7 @@
         </w:tc>
         <w:tc>
           <w:tcPr>
-            <w:tcW w:type="dxa" w:w="2016"/>
+            <w:tcW w:type="dxa" w:w="1354"/>
           </w:tcPr>
           <w:p>
             <w:pPr>
@@ -4920,7 +4920,7 @@
         </w:trPr>
         <w:tc>
           <w:tcPr>
-            <w:tcW w:type="dxa" w:w="1814"/>
+            <w:tcW w:type="dxa" w:w="1218"/>
           </w:tcPr>
           <w:p>
             <w:pPr>
@@ -4939,7 +4939,7 @@
         </w:tc>
         <w:tc>
           <w:tcPr>
-            <w:tcW w:type="dxa" w:w="1613"/>
+            <w:tcW w:type="dxa" w:w="4062"/>
           </w:tcPr>
           <w:p>
             <w:pPr>
@@ -4952,13 +4952,13 @@
                 <w:b w:val="0"/>
                 <w:sz w:val="17"/>
               </w:rPr>
-              <w:t>29</w:t>
+              <w:t>Welche Kurse kann eine Person jetzt neu beginnen, weil sie alle nötigen Vorkurse bestanden hat und den Kurs noch nicht besucht?</w:t>
             </w:r>
           </w:p>
         </w:tc>
         <w:tc>
           <w:tcPr>
-            <w:tcW w:type="dxa" w:w="2016"/>
+            <w:tcW w:type="dxa" w:w="1354"/>
           </w:tcPr>
           <w:p>
             <w:pPr>
@@ -4977,7 +4977,7 @@
         </w:tc>
         <w:tc>
           <w:tcPr>
-            <w:tcW w:type="dxa" w:w="1613"/>
+            <w:tcW w:type="dxa" w:w="1083"/>
           </w:tcPr>
           <w:p>
             <w:pPr>
@@ -4996,7 +4996,7 @@
         </w:tc>
         <w:tc>
           <w:tcPr>
-            <w:tcW w:type="dxa" w:w="2016"/>
+            <w:tcW w:type="dxa" w:w="1354"/>
           </w:tcPr>
           <w:p>
             <w:pPr>
@@ -5020,7 +5020,7 @@
         </w:trPr>
         <w:tc>
           <w:tcPr>
-            <w:tcW w:type="dxa" w:w="1814"/>
+            <w:tcW w:type="dxa" w:w="1218"/>
           </w:tcPr>
           <w:p>
             <w:pPr>
@@ -5039,7 +5039,7 @@
         </w:tc>
         <w:tc>
           <w:tcPr>
-            <w:tcW w:type="dxa" w:w="1613"/>
+            <w:tcW w:type="dxa" w:w="4062"/>
           </w:tcPr>
           <w:p>
             <w:pPr>
@@ -5052,13 +5052,13 @@
                 <w:b w:val="0"/>
                 <w:sz w:val="17"/>
               </w:rPr>
-              <w:t>22</w:t>
+              <w:t>Was fehlt einer Person noch bis zu ihrem Zielkurs, und wie viele Stunden sind das? Ein Kurs, den sie gerade besucht, zählt noch als fehlend</w:t>
             </w:r>
           </w:p>
         </w:tc>
         <w:tc>
           <w:tcPr>
-            <w:tcW w:type="dxa" w:w="2016"/>
+            <w:tcW w:type="dxa" w:w="1354"/>
           </w:tcPr>
           <w:p>
             <w:pPr>
@@ -5077,7 +5077,7 @@
         </w:tc>
         <w:tc>
           <w:tcPr>
-            <w:tcW w:type="dxa" w:w="1613"/>
+            <w:tcW w:type="dxa" w:w="1083"/>
           </w:tcPr>
           <w:p>
             <w:pPr>
@@ -5096,7 +5096,7 @@
         </w:tc>
         <w:tc>
           <w:tcPr>
-            <w:tcW w:type="dxa" w:w="2016"/>
+            <w:tcW w:type="dxa" w:w="1354"/>
           </w:tcPr>
           <w:p>
             <w:pPr>
@@ -5120,7 +5120,7 @@
         </w:trPr>
         <w:tc>
           <w:tcPr>
-            <w:tcW w:type="dxa" w:w="1814"/>
+            <w:tcW w:type="dxa" w:w="1218"/>
           </w:tcPr>
           <w:p>
             <w:pPr>
@@ -5138,7 +5138,7 @@
         </w:tc>
         <w:tc>
           <w:tcPr>
-            <w:tcW w:type="dxa" w:w="1613"/>
+            <w:tcW w:type="dxa" w:w="4062"/>
           </w:tcPr>
           <w:p>
             <w:pPr>
@@ -5150,13 +5150,13 @@
                 <w:b w:val="0"/>
                 <w:sz w:val="17"/>
               </w:rPr>
-              <w:t>38</w:t>
+              <w:t>Wo und bei wem kann eine Person diese Kurse in einem bestimmten Semester an ihrem Standort und in ihrer Studienform (Voll- oder Teilzeit) besuchen?</w:t>
             </w:r>
           </w:p>
         </w:tc>
         <w:tc>
           <w:tcPr>
-            <w:tcW w:type="dxa" w:w="2016"/>
+            <w:tcW w:type="dxa" w:w="1354"/>
           </w:tcPr>
           <w:p>
             <w:pPr>
@@ -5174,7 +5174,7 @@
         </w:tc>
         <w:tc>
           <w:tcPr>
-            <w:tcW w:type="dxa" w:w="1613"/>
+            <w:tcW w:type="dxa" w:w="1083"/>
           </w:tcPr>
           <w:p>
             <w:pPr>
@@ -5192,7 +5192,7 @@
         </w:tc>
         <w:tc>
           <w:tcPr>
-            <w:tcW w:type="dxa" w:w="2016"/>
+            <w:tcW w:type="dxa" w:w="1354"/>
           </w:tcPr>
           <w:p>
             <w:pPr>

</xml_diff>

<commit_message>
Update report and summary for renamed courses
</commit_message>
<xml_diff>
--- a/docs/MC3_Bericht_Pulver_Urech.docx
+++ b/docs/MC3_Bericht_Pulver_Urech.docx
@@ -604,9 +604,9 @@
         <w:tblLook w:firstColumn="1" w:firstRow="1" w:lastColumn="0" w:lastRow="0" w:noHBand="0" w:noVBand="1" w:val="04A0"/>
       </w:tblPr>
       <w:tblGrid>
-        <w:gridCol w:w="1165"/>
-        <w:gridCol w:w="4993"/>
-        <w:gridCol w:w="2913"/>
+        <w:gridCol w:w="948"/>
+        <w:gridCol w:w="4062"/>
+        <w:gridCol w:w="4062"/>
       </w:tblGrid>
       <w:tr>
         <w:trPr>
@@ -614,7 +614,7 @@
         </w:trPr>
         <w:tc>
           <w:tcPr>
-            <w:tcW w:type="dxa" w:w="1165"/>
+            <w:tcW w:type="dxa" w:w="948"/>
             <w:shd w:val="clear" w:color="auto" w:fill="DCE6F0"/>
           </w:tcPr>
           <w:p>
@@ -634,7 +634,7 @@
         </w:tc>
         <w:tc>
           <w:tcPr>
-            <w:tcW w:type="dxa" w:w="4993"/>
+            <w:tcW w:type="dxa" w:w="4062"/>
             <w:shd w:val="clear" w:color="auto" w:fill="DCE6F0"/>
           </w:tcPr>
           <w:p>
@@ -654,7 +654,7 @@
         </w:tc>
         <w:tc>
           <w:tcPr>
-            <w:tcW w:type="dxa" w:w="2913"/>
+            <w:tcW w:type="dxa" w:w="4062"/>
             <w:shd w:val="clear" w:color="auto" w:fill="DCE6F0"/>
           </w:tcPr>
           <w:p>
@@ -668,7 +668,7 @@
                 <w:b/>
                 <w:sz w:val="17"/>
               </w:rPr>
-              <w:t>Beteiligte Entitäten</w:t>
+              <w:t>Beispiel</w:t>
             </w:r>
           </w:p>
         </w:tc>
@@ -679,7 +679,7 @@
         </w:trPr>
         <w:tc>
           <w:tcPr>
-            <w:tcW w:type="dxa" w:w="1165"/>
+            <w:tcW w:type="dxa" w:w="948"/>
           </w:tcPr>
           <w:p>
             <w:pPr>
@@ -698,7 +698,7 @@
         </w:tc>
         <w:tc>
           <w:tcPr>
-            <w:tcW w:type="dxa" w:w="4993"/>
+            <w:tcW w:type="dxa" w:w="4062"/>
           </w:tcPr>
           <w:p>
             <w:pPr>
@@ -711,13 +711,13 @@
                 <w:b w:val="0"/>
                 <w:sz w:val="17"/>
               </w:rPr>
-              <w:t>Welche Kurse braucht man direkt, bevor man einen bestimmten Kurs besuchen darf?</w:t>
+              <w:t>Welche Kurse sind als Voraussetzung eines Kurses eingetragen?</w:t>
             </w:r>
           </w:p>
         </w:tc>
         <w:tc>
           <w:tcPr>
-            <w:tcW w:type="dxa" w:w="2913"/>
+            <w:tcW w:type="dxa" w:w="4062"/>
           </w:tcPr>
           <w:p>
             <w:pPr>
@@ -730,7 +730,7 @@
                 <w:b w:val="0"/>
                 <w:sz w:val="17"/>
               </w:rPr>
-              <w:t>Kurs</w:t>
+              <w:t>ML: ALGEBRA, ANALYSIS, EDA, PYTHON</w:t>
             </w:r>
           </w:p>
         </w:tc>
@@ -741,7 +741,7 @@
         </w:trPr>
         <w:tc>
           <w:tcPr>
-            <w:tcW w:type="dxa" w:w="1165"/>
+            <w:tcW w:type="dxa" w:w="948"/>
           </w:tcPr>
           <w:p>
             <w:pPr>
@@ -760,7 +760,7 @@
         </w:tc>
         <w:tc>
           <w:tcPr>
-            <w:tcW w:type="dxa" w:w="4993"/>
+            <w:tcW w:type="dxa" w:w="4062"/>
           </w:tcPr>
           <w:p>
             <w:pPr>
@@ -773,13 +773,13 @@
                 <w:b w:val="0"/>
                 <w:sz w:val="17"/>
               </w:rPr>
-              <w:t>Welche Kurse braucht man insgesamt für einen Kurs, also auch die Vorkurse der Vorkurse? Jeder Kurs wird nur einmal genannt</w:t>
+              <w:t>Welche Kurse muss man insgesamt abschliessen, bevor man einen Kurs beginnen kann?</w:t>
             </w:r>
           </w:p>
         </w:tc>
         <w:tc>
           <w:tcPr>
-            <w:tcW w:type="dxa" w:w="2913"/>
+            <w:tcW w:type="dxa" w:w="4062"/>
           </w:tcPr>
           <w:p>
             <w:pPr>
@@ -792,7 +792,7 @@
                 <w:b w:val="0"/>
                 <w:sz w:val="17"/>
               </w:rPr>
-              <w:t>Kurs</w:t>
+              <w:t>ML: zusätzlich BASICS und SQL, also 6 Kurse</w:t>
             </w:r>
           </w:p>
         </w:tc>
@@ -803,7 +803,7 @@
         </w:trPr>
         <w:tc>
           <w:tcPr>
-            <w:tcW w:type="dxa" w:w="1165"/>
+            <w:tcW w:type="dxa" w:w="948"/>
           </w:tcPr>
           <w:p>
             <w:pPr>
@@ -822,7 +822,7 @@
         </w:tc>
         <w:tc>
           <w:tcPr>
-            <w:tcW w:type="dxa" w:w="4993"/>
+            <w:tcW w:type="dxa" w:w="4062"/>
           </w:tcPr>
           <w:p>
             <w:pPr>
@@ -835,13 +835,13 @@
                 <w:b w:val="0"/>
                 <w:sz w:val="17"/>
               </w:rPr>
-              <w:t>Welche Kurse kann eine Person jetzt neu beginnen, weil sie alle nötigen Vorkurse bestanden hat und den Kurs noch nicht besucht?</w:t>
+              <w:t>Welche Kurse kann eine Person als Nächstes beginnen?</w:t>
             </w:r>
           </w:p>
         </w:tc>
         <w:tc>
           <w:tcPr>
-            <w:tcW w:type="dxa" w:w="2913"/>
+            <w:tcW w:type="dxa" w:w="4062"/>
           </w:tcPr>
           <w:p>
             <w:pPr>
@@ -854,7 +854,7 @@
                 <w:b w:val="0"/>
                 <w:sz w:val="17"/>
               </w:rPr>
-              <w:t>Lernende Person, Durchführung, Kurs</w:t>
+              <w:t>Student A: ALGEBRA, DB_MODELING, PYTHON</w:t>
             </w:r>
           </w:p>
         </w:tc>
@@ -865,7 +865,7 @@
         </w:trPr>
         <w:tc>
           <w:tcPr>
-            <w:tcW w:type="dxa" w:w="1165"/>
+            <w:tcW w:type="dxa" w:w="948"/>
           </w:tcPr>
           <w:p>
             <w:pPr>
@@ -884,7 +884,7 @@
         </w:tc>
         <w:tc>
           <w:tcPr>
-            <w:tcW w:type="dxa" w:w="4993"/>
+            <w:tcW w:type="dxa" w:w="4062"/>
           </w:tcPr>
           <w:p>
             <w:pPr>
@@ -897,13 +897,13 @@
                 <w:b w:val="0"/>
                 <w:sz w:val="17"/>
               </w:rPr>
-              <w:t>Was fehlt einer Person noch bis zu ihrem Zielkurs, und wie viele Stunden sind das? Ein Kurs, den sie gerade besucht, zählt noch als fehlend</w:t>
+              <w:t>Welche Kurse fehlen einer Person noch für einen Zielkurs, und wie viele Stunden sind das?</w:t>
             </w:r>
           </w:p>
         </w:tc>
         <w:tc>
           <w:tcPr>
-            <w:tcW w:type="dxa" w:w="2913"/>
+            <w:tcW w:type="dxa" w:w="4062"/>
           </w:tcPr>
           <w:p>
             <w:pPr>
@@ -916,7 +916,7 @@
                 <w:b w:val="0"/>
                 <w:sz w:val="17"/>
               </w:rPr>
-              <w:t>Lernende Person, Durchführung, Kurs</w:t>
+              <w:t>Student A und ML: 4 Kurse, 26 Stunden</w:t>
             </w:r>
           </w:p>
         </w:tc>
@@ -927,7 +927,7 @@
         </w:trPr>
         <w:tc>
           <w:tcPr>
-            <w:tcW w:type="dxa" w:w="1165"/>
+            <w:tcW w:type="dxa" w:w="948"/>
           </w:tcPr>
           <w:p>
             <w:pPr>
@@ -945,7 +945,7 @@
         </w:tc>
         <w:tc>
           <w:tcPr>
-            <w:tcW w:type="dxa" w:w="4993"/>
+            <w:tcW w:type="dxa" w:w="4062"/>
           </w:tcPr>
           <w:p>
             <w:pPr>
@@ -957,13 +957,13 @@
                 <w:b w:val="0"/>
                 <w:sz w:val="17"/>
               </w:rPr>
-              <w:t>Wo und bei wem kann eine Person diese Kurse in einem bestimmten Semester an ihrem Standort und in ihrer Studienform (Voll- oder Teilzeit) besuchen?</w:t>
+              <w:t>Wann, wo und bei wem kann eine Person diese Kurse besuchen?</w:t>
             </w:r>
           </w:p>
         </w:tc>
         <w:tc>
           <w:tcPr>
-            <w:tcW w:type="dxa" w:w="2913"/>
+            <w:tcW w:type="dxa" w:w="4062"/>
           </w:tcPr>
           <w:p>
             <w:pPr>
@@ -975,7 +975,7 @@
                 <w:b w:val="0"/>
                 <w:sz w:val="17"/>
               </w:rPr>
-              <w:t>alle sechs</w:t>
+              <w:t>Student A, FS27, Brugg-Windisch: ALGEBRA bei S. Huber, DB_MODELING bei M. Frei, PYTHON bei T. Brunner</w:t>
             </w:r>
           </w:p>
         </w:tc>
@@ -2191,7 +2191,7 @@
         <w:rPr>
           <w:b/>
         </w:rPr>
-        <w:t>8</w:t>
+        <w:t>7</w:t>
       </w:r>
       <w:r>
         <w:rPr>
@@ -2203,7 +2203,7 @@
         <w:rPr>
           <w:b/>
         </w:rPr>
-        <w:t>7</w:t>
+        <w:t>6</w:t>
       </w:r>
       <w:r>
         <w:rPr>
@@ -2578,7 +2578,7 @@
         <w:rPr>
           <w:b w:val="0"/>
         </w:rPr>
-        <w:t xml:space="preserve"> Prüfungen zu Abfragen, Integrität, Export und Import, Datenänderungen und Strukturänderungen. Die Prüfungen laufen in einer Transaktion und hinterlassen keine Änderungen. Auf PostgreSQL sind alle bestanden. Für Person 1 fehlen vor </w:t>
+        <w:t xml:space="preserve"> Prüfungen zu Abfragen, Integrität, Export und Import, Datenänderungen und Strukturänderungen. Die Prüfungen laufen in einer Transaktion und hinterlassen keine Änderungen. Auf PostgreSQL sind alle bestanden. Student A fehlen für </w:t>
       </w:r>
       <w:r>
         <w:rPr>
@@ -2586,7 +2586,7 @@
           <w:b w:val="0"/>
           <w:sz w:val="18"/>
         </w:rPr>
-        <w:t>PROJ</w:t>
+        <w:t>ML</w:t>
       </w:r>
       <w:r>
         <w:rPr>
@@ -2598,19 +2598,19 @@
         <w:rPr>
           <w:b/>
         </w:rPr>
-        <w:t>5</w:t>
-      </w:r>
-      <w:r>
-        <w:rPr>
-          <w:b w:val="0"/>
-        </w:rPr>
-        <w:t xml:space="preserve"> Vorkurse mit </w:t>
+        <w:t>4</w:t>
+      </w:r>
+      <w:r>
+        <w:rPr>
+          <w:b w:val="0"/>
+        </w:rPr>
+        <w:t xml:space="preserve"> Kurse mit </w:t>
       </w:r>
       <w:r>
         <w:rPr>
           <w:b/>
         </w:rPr>
-        <w:t>42</w:t>
+        <w:t>26</w:t>
       </w:r>
       <w:r>
         <w:rPr>
@@ -2659,13 +2659,13 @@
         <w:rPr>
           <w:b w:val="0"/>
         </w:rPr>
-        <w:t>Die laufende Belegung von Person 3 in SQL zählt bei A-004 als fehlend (</w:t>
+        <w:t>Die laufende Belegung von Student C in PYTHON zählt bei A-004 als fehlend (</w:t>
       </w:r>
       <w:r>
         <w:rPr>
           <w:b/>
         </w:rPr>
-        <w:t>56</w:t>
+        <w:t>34</w:t>
       </w:r>
       <w:r>
         <w:rPr>
@@ -2677,7 +2677,7 @@
         <w:rPr>
           <w:b/>
         </w:rPr>
-        <w:t>48</w:t>
+        <w:t>26</w:t>
       </w:r>
       <w:r>
         <w:rPr>
@@ -2698,7 +2698,7 @@
         <w:rPr>
           <w:b w:val="0"/>
         </w:rPr>
-        <w:t>A-005 filtert nach Studienform. Person 2 (Teilzeit) erhält in FS27 in Olten nur MOD</w:t>
+        <w:t>A-005 berücksichtigt Studienform und Voraussetzungen. Student B (Teilzeit) erhält in FS27 in Olten ANALYSIS und SQL, aber nicht DB_MODELING, weil SQL noch fehlt</w:t>
       </w:r>
     </w:p>
     <w:p>
@@ -5150,7 +5150,7 @@
                 <w:b w:val="0"/>
                 <w:sz w:val="17"/>
               </w:rPr>
-              <w:t>Wo und bei wem kann eine Person diese Kurse in einem bestimmten Semester an ihrem Standort und in ihrer Studienform (Voll- oder Teilzeit) besuchen?</w:t>
+              <w:t>Wo und bei wem kann eine Person ihre nächsten Kurse aus A-003 in einem bestimmten Semester besuchen, passend zu ihrem Standort und ihrer Studienform (Voll- oder Teilzeit)?</w:t>
             </w:r>
           </w:p>
         </w:tc>

</xml_diff>

<commit_message>
Update measurement and report with final queries
</commit_message>
<xml_diff>
--- a/docs/MC3_Bericht_Pulver_Urech.docx
+++ b/docs/MC3_Bericht_Pulver_Urech.docx
@@ -4296,7 +4296,7 @@
                 <w:b w:val="0"/>
                 <w:sz w:val="17"/>
               </w:rPr>
-              <w:t>1.06</w:t>
+              <w:t>0.90</w:t>
             </w:r>
           </w:p>
         </w:tc>
@@ -4315,7 +4315,7 @@
                 <w:b w:val="0"/>
                 <w:sz w:val="17"/>
               </w:rPr>
-              <w:t>3.09</w:t>
+              <w:t>2.05</w:t>
             </w:r>
           </w:p>
         </w:tc>
@@ -4353,7 +4353,7 @@
                 <w:b w:val="0"/>
                 <w:sz w:val="17"/>
               </w:rPr>
-              <w:t>1.14</w:t>
+              <w:t>1.10</w:t>
             </w:r>
           </w:p>
         </w:tc>
@@ -4372,7 +4372,7 @@
                 <w:b w:val="0"/>
                 <w:sz w:val="17"/>
               </w:rPr>
-              <w:t>2.79</w:t>
+              <w:t>2.15</w:t>
             </w:r>
           </w:p>
         </w:tc>
@@ -4472,7 +4472,7 @@
                 <w:b w:val="0"/>
                 <w:sz w:val="17"/>
               </w:rPr>
-              <w:t>1.28</w:t>
+              <w:t>0.92</w:t>
             </w:r>
           </w:p>
         </w:tc>
@@ -4491,7 +4491,7 @@
                 <w:b w:val="0"/>
                 <w:sz w:val="17"/>
               </w:rPr>
-              <w:t>4.51</w:t>
+              <w:t>2.60</w:t>
             </w:r>
           </w:p>
         </w:tc>
@@ -4529,7 +4529,7 @@
                 <w:b w:val="0"/>
                 <w:sz w:val="17"/>
               </w:rPr>
-              <w:t>1.31</w:t>
+              <w:t>0.89</w:t>
             </w:r>
           </w:p>
         </w:tc>
@@ -4548,7 +4548,7 @@
                 <w:b w:val="0"/>
                 <w:sz w:val="17"/>
               </w:rPr>
-              <w:t>4.09</w:t>
+              <w:t>1.69</w:t>
             </w:r>
           </w:p>
         </w:tc>
@@ -4648,7 +4648,7 @@
                 <w:b w:val="0"/>
                 <w:sz w:val="17"/>
               </w:rPr>
-              <w:t>2.04</w:t>
+              <w:t>1.53</w:t>
             </w:r>
           </w:p>
         </w:tc>
@@ -4667,7 +4667,7 @@
                 <w:b w:val="0"/>
                 <w:sz w:val="17"/>
               </w:rPr>
-              <w:t>7.19</w:t>
+              <w:t>4.87</w:t>
             </w:r>
           </w:p>
         </w:tc>
@@ -4705,7 +4705,7 @@
                 <w:b w:val="0"/>
                 <w:sz w:val="17"/>
               </w:rPr>
-              <w:t>2.01</w:t>
+              <w:t>1.49</w:t>
             </w:r>
           </w:p>
         </w:tc>
@@ -4724,7 +4724,7 @@
                 <w:b w:val="0"/>
                 <w:sz w:val="17"/>
               </w:rPr>
-              <w:t>5.71</w:t>
+              <w:t>3.06</w:t>
             </w:r>
           </w:p>
         </w:tc>
@@ -4824,7 +4824,7 @@
                 <w:b w:val="0"/>
                 <w:sz w:val="17"/>
               </w:rPr>
-              <w:t>3.13</w:t>
+              <w:t>2.85</w:t>
             </w:r>
           </w:p>
         </w:tc>
@@ -4843,7 +4843,7 @@
                 <w:b w:val="0"/>
                 <w:sz w:val="17"/>
               </w:rPr>
-              <w:t>12.35</w:t>
+              <w:t>10.08</w:t>
             </w:r>
           </w:p>
         </w:tc>
@@ -4881,7 +4881,7 @@
                 <w:b w:val="0"/>
                 <w:sz w:val="17"/>
               </w:rPr>
-              <w:t>3.02</w:t>
+              <w:t>2.77</w:t>
             </w:r>
           </w:p>
         </w:tc>
@@ -4900,7 +4900,7 @@
                 <w:b w:val="0"/>
                 <w:sz w:val="17"/>
               </w:rPr>
-              <w:t>10.73</w:t>
+              <w:t>7.08</w:t>
             </w:r>
           </w:p>
         </w:tc>
@@ -5000,7 +5000,7 @@
                 <w:b w:val="0"/>
                 <w:sz w:val="17"/>
               </w:rPr>
-              <w:t>5.13</w:t>
+              <w:t>4.26</w:t>
             </w:r>
           </w:p>
         </w:tc>
@@ -5019,7 +5019,7 @@
                 <w:b w:val="0"/>
                 <w:sz w:val="17"/>
               </w:rPr>
-              <w:t>22.98</w:t>
+              <w:t>18.60</w:t>
             </w:r>
           </w:p>
         </w:tc>
@@ -5057,7 +5057,7 @@
                 <w:b w:val="0"/>
                 <w:sz w:val="17"/>
               </w:rPr>
-              <w:t>5.29</w:t>
+              <w:t>4.55</w:t>
             </w:r>
           </w:p>
         </w:tc>
@@ -5076,7 +5076,7 @@
                 <w:b w:val="0"/>
                 <w:sz w:val="17"/>
               </w:rPr>
-              <w:t>14.69</w:t>
+              <w:t>12.27</w:t>
             </w:r>
           </w:p>
         </w:tc>
@@ -5176,7 +5176,7 @@
                 <w:b w:val="0"/>
                 <w:sz w:val="17"/>
               </w:rPr>
-              <w:t>1.43</w:t>
+              <w:t>1.22</w:t>
             </w:r>
           </w:p>
         </w:tc>
@@ -5195,7 +5195,7 @@
                 <w:b w:val="0"/>
                 <w:sz w:val="17"/>
               </w:rPr>
-              <w:t>3.55</w:t>
+              <w:t>2.84</w:t>
             </w:r>
           </w:p>
         </w:tc>
@@ -5233,7 +5233,7 @@
                 <w:b w:val="0"/>
                 <w:sz w:val="17"/>
               </w:rPr>
-              <w:t>1.43</w:t>
+              <w:t>1.17</w:t>
             </w:r>
           </w:p>
         </w:tc>
@@ -5252,7 +5252,7 @@
                 <w:b w:val="0"/>
                 <w:sz w:val="17"/>
               </w:rPr>
-              <w:t>2.35</w:t>
+              <w:t>1.79</w:t>
             </w:r>
           </w:p>
         </w:tc>
@@ -5352,7 +5352,7 @@
                 <w:b w:val="0"/>
                 <w:sz w:val="17"/>
               </w:rPr>
-              <w:t>2.36</w:t>
+              <w:t>1.93</w:t>
             </w:r>
           </w:p>
         </w:tc>
@@ -5371,7 +5371,7 @@
                 <w:b w:val="0"/>
                 <w:sz w:val="17"/>
               </w:rPr>
-              <w:t>6.99</w:t>
+              <w:t>5.55</w:t>
             </w:r>
           </w:p>
         </w:tc>
@@ -5409,7 +5409,7 @@
                 <w:b w:val="0"/>
                 <w:sz w:val="17"/>
               </w:rPr>
-              <w:t>2.59</w:t>
+              <w:t>1.89</w:t>
             </w:r>
           </w:p>
         </w:tc>
@@ -5428,7 +5428,7 @@
                 <w:b w:val="0"/>
                 <w:sz w:val="17"/>
               </w:rPr>
-              <w:t>3.54</w:t>
+              <w:t>2.38</w:t>
             </w:r>
           </w:p>
         </w:tc>
@@ -5523,7 +5523,7 @@
                 <w:b w:val="0"/>
                 <w:sz w:val="17"/>
               </w:rPr>
-              <w:t>3.34</w:t>
+              <w:t>2.62</w:t>
             </w:r>
           </w:p>
         </w:tc>
@@ -5541,7 +5541,7 @@
                 <w:b w:val="0"/>
                 <w:sz w:val="17"/>
               </w:rPr>
-              <w:t>12.69</w:t>
+              <w:t>9.79</w:t>
             </w:r>
           </w:p>
         </w:tc>
@@ -5577,7 +5577,7 @@
                 <w:b w:val="0"/>
                 <w:sz w:val="17"/>
               </w:rPr>
-              <w:t>3.16</w:t>
+              <w:t>2.38</w:t>
             </w:r>
           </w:p>
         </w:tc>
@@ -5595,7 +5595,7 @@
                 <w:b w:val="0"/>
                 <w:sz w:val="17"/>
               </w:rPr>
-              <w:t>4.86</w:t>
+              <w:t>3.14</w:t>
             </w:r>
           </w:p>
         </w:tc>
@@ -5737,7 +5737,7 @@
         <w:rPr>
           <w:b/>
         </w:rPr>
-        <w:t>2.5</w:t>
+        <w:t>2.3</w:t>
       </w:r>
       <w:r>
         <w:rPr>
@@ -5749,7 +5749,7 @@
         <w:rPr>
           <w:b/>
         </w:rPr>
-        <w:t>4.5</w:t>
+        <w:t>4.4</w:t>
       </w:r>
       <w:r>
         <w:rPr>
@@ -5761,7 +5761,7 @@
         <w:rPr>
           <w:b/>
         </w:rPr>
-        <w:t>1.4</w:t>
+        <w:t>1.3</w:t>
       </w:r>
       <w:r>
         <w:rPr>
@@ -5773,7 +5773,7 @@
         <w:rPr>
           <w:b/>
         </w:rPr>
-        <w:t>3.6</w:t>
+        <w:t>2.7</w:t>
       </w:r>
       <w:r>
         <w:rPr>
@@ -5830,7 +5830,7 @@
         <w:rPr>
           <w:b/>
         </w:rPr>
-        <w:t>1.06</w:t>
+        <w:t>0.90</w:t>
       </w:r>
       <w:r>
         <w:rPr>
@@ -5842,7 +5842,7 @@
         <w:rPr>
           <w:b/>
         </w:rPr>
-        <w:t>5.13 ms</w:t>
+        <w:t>4.26 ms</w:t>
       </w:r>
       <w:r>
         <w:rPr>
@@ -5854,7 +5854,7 @@
         <w:rPr>
           <w:b/>
         </w:rPr>
-        <w:t>3.09</w:t>
+        <w:t>2.05</w:t>
       </w:r>
       <w:r>
         <w:rPr>
@@ -5866,7 +5866,7 @@
         <w:rPr>
           <w:b/>
         </w:rPr>
-        <w:t>22.98 ms</w:t>
+        <w:t>18.60 ms</w:t>
       </w:r>
       <w:r>
         <w:rPr>
@@ -6025,7 +6025,7 @@
                 <w:b/>
                 <w:sz w:val="17"/>
               </w:rPr>
-              <w:t>2.9</w:t>
+              <w:t>2.3</w:t>
             </w:r>
             <w:r>
               <w:rPr>
@@ -6039,7 +6039,7 @@
                 <w:b/>
                 <w:sz w:val="17"/>
               </w:rPr>
-              <w:t>4.5</w:t>
+              <w:t>4.4</w:t>
             </w:r>
             <w:r>
               <w:rPr>

</xml_diff>